<commit_message>
Add Neimira logo mark to pilot questionnaire headers
Reuses the existing waiting-screen SVG logo mark from launch.html
(rendered to PNG) in the top-right corner of each of the three
questionnaires, saved to docs/assets/ for reuse in future documents.

Co-Authored-By: Claude Sonnet 5 <noreply@anthropic.com>
Claude-Session: https://claude.ai/code/session_01GhHYXTvPcTQbmvy93Ygmjf
</commit_message>
<xml_diff>
--- a/docs/pilot/questionnaires/family-questionnaire.docx
+++ b/docs/pilot/questionnaires/family-questionnaire.docx
@@ -2,51 +2,143 @@
 <file path=word/document.xml><?xml version="1.0" encoding="utf-8"?>
 <w:document xmlns:wpc="http://schemas.microsoft.com/office/word/2010/wordprocessingCanvas" xmlns:mc="http://schemas.openxmlformats.org/markup-compatibility/2006" xmlns:o="urn:schemas-microsoft-com:office:office" xmlns:r="http://schemas.openxmlformats.org/officeDocument/2006/relationships" xmlns:m="http://schemas.openxmlformats.org/officeDocument/2006/math" xmlns:v="urn:schemas-microsoft-com:vml" xmlns:wp14="http://schemas.microsoft.com/office/word/2010/wordprocessingDrawing" xmlns:wp="http://schemas.openxmlformats.org/drawingml/2006/wordprocessingDrawing" xmlns:w10="urn:schemas-microsoft-com:office:word" xmlns:w="http://schemas.openxmlformats.org/wordprocessingml/2006/main" xmlns:w14="http://schemas.microsoft.com/office/word/2010/wordml" xmlns:w15="http://schemas.microsoft.com/office/word/2012/wordml" xmlns:wpg="http://schemas.microsoft.com/office/word/2010/wordprocessingGroup" xmlns:wpi="http://schemas.microsoft.com/office/word/2010/wordprocessingInk" xmlns:wne="http://schemas.microsoft.com/office/word/2006/wordml" xmlns:wps="http://schemas.microsoft.com/office/word/2010/wordprocessingShape" xmlns:cx="http://schemas.microsoft.com/office/drawing/2014/chartex" xmlns:cx1="http://schemas.microsoft.com/office/drawing/2015/9/8/chartex" xmlns:cx2="http://schemas.microsoft.com/office/drawing/2015/10/21/chartex" xmlns:cx3="http://schemas.microsoft.com/office/drawing/2016/5/9/chartex" xmlns:cx4="http://schemas.microsoft.com/office/drawing/2016/5/10/chartex" xmlns:cx5="http://schemas.microsoft.com/office/drawing/2016/5/11/chartex" xmlns:cx6="http://schemas.microsoft.com/office/drawing/2016/5/12/chartex" xmlns:cx7="http://schemas.microsoft.com/office/drawing/2016/5/13/chartex" xmlns:cx8="http://schemas.microsoft.com/office/drawing/2016/5/14/chartex" xmlns:aink="http://schemas.microsoft.com/office/drawing/2016/ink" xmlns:am3d="http://schemas.microsoft.com/office/drawing/2017/model3d" xmlns:w16cex="http://schemas.microsoft.com/office/word/2018/wordml/cex" xmlns:w16cid="http://schemas.microsoft.com/office/word/2016/wordml/cid" xmlns:w16="http://schemas.microsoft.com/office/word/2018/wordml" xmlns:w16sdtdh="http://schemas.microsoft.com/office/word/2020/wordml/sdtdatahash" xmlns:w16se="http://schemas.microsoft.com/office/word/2015/wordml/symex" mc:Ignorable="w14 w15 wp14">
   <w:body>
-    <w:p>
-      <w:pPr>
-        <w:spacing w:after="40"/>
-      </w:pPr>
-      <w:r>
-        <w:rPr>
-          <w:b/>
-          <w:bCs/>
-          <w:color w:val="1F3B57"/>
-          <w:spacing w:val="20"/>
-          <w:sz w:val="20"/>
-          <w:szCs w:val="20"/>
-        </w:rPr>
-        <w:t xml:space="preserve">NEIMIRA PILOT PROGRAM</w:t>
-      </w:r>
-    </w:p>
-    <w:p>
-      <w:pPr>
-        <w:spacing w:after="60"/>
-      </w:pPr>
-      <w:r>
-        <w:rPr>
-          <w:b/>
-          <w:bCs/>
-          <w:color w:val="1F3B57"/>
-          <w:sz w:val="40"/>
-          <w:szCs w:val="40"/>
-        </w:rPr>
-        <w:t xml:space="preserve">Family Member Questionnaire</w:t>
-      </w:r>
-    </w:p>
+    <w:tbl>
+      <w:tblPr>
+        <w:tblW w:type="dxa" w:w="10080"/>
+        <w:tblBorders>
+          <w:top w:val="single" w:color="auto" w:sz="4"/>
+          <w:left w:val="single" w:color="auto" w:sz="4"/>
+          <w:bottom w:val="single" w:color="auto" w:sz="4"/>
+          <w:right w:val="single" w:color="auto" w:sz="4"/>
+          <w:insideH w:val="single" w:color="auto" w:sz="4"/>
+          <w:insideV w:val="single" w:color="auto" w:sz="4"/>
+        </w:tblBorders>
+      </w:tblPr>
+      <w:tblGrid>
+        <w:gridCol w:w="8380"/>
+        <w:gridCol w:w="1700"/>
+      </w:tblGrid>
+      <w:tr>
+        <w:tc>
+          <w:tcPr>
+            <w:tcW w:type="dxa" w:w="8380"/>
+            <w:tcBorders>
+              <w:top w:val="none" w:color="FFFFFF" w:sz="0"/>
+              <w:left w:val="none" w:color="FFFFFF" w:sz="0"/>
+              <w:bottom w:val="none" w:color="FFFFFF" w:sz="0"/>
+              <w:right w:val="none" w:color="FFFFFF" w:sz="0"/>
+            </w:tcBorders>
+          </w:tcPr>
+          <w:p>
+            <w:pPr>
+              <w:spacing w:after="40"/>
+            </w:pPr>
+            <w:r>
+              <w:rPr>
+                <w:b/>
+                <w:bCs/>
+                <w:color w:val="1F3B57"/>
+                <w:spacing w:val="20"/>
+                <w:sz w:val="20"/>
+                <w:szCs w:val="20"/>
+              </w:rPr>
+              <w:t xml:space="preserve">NEIMIRA PILOT PROGRAM</w:t>
+            </w:r>
+          </w:p>
+          <w:p>
+            <w:pPr>
+              <w:spacing w:after="60"/>
+            </w:pPr>
+            <w:r>
+              <w:rPr>
+                <w:b/>
+                <w:bCs/>
+                <w:color w:val="1F3B57"/>
+                <w:sz w:val="40"/>
+                <w:szCs w:val="40"/>
+              </w:rPr>
+              <w:t xml:space="preserve">Family Member Questionnaire</w:t>
+            </w:r>
+          </w:p>
+          <w:p>
+            <w:pPr>
+              <w:spacing w:after="0"/>
+            </w:pPr>
+            <w:r>
+              <w:rPr>
+                <w:i/>
+                <w:iCs/>
+                <w:color w:val="444444"/>
+                <w:sz w:val="22"/>
+                <w:szCs w:val="22"/>
+              </w:rPr>
+              <w:t xml:space="preserve">Your observations help us understand how the program is working.</w:t>
+            </w:r>
+          </w:p>
+        </w:tc>
+        <w:tc>
+          <w:tcPr>
+            <w:tcW w:type="dxa" w:w="1700"/>
+            <w:tcBorders>
+              <w:top w:val="none" w:color="FFFFFF" w:sz="0"/>
+              <w:left w:val="none" w:color="FFFFFF" w:sz="0"/>
+              <w:bottom w:val="none" w:color="FFFFFF" w:sz="0"/>
+              <w:right w:val="none" w:color="FFFFFF" w:sz="0"/>
+            </w:tcBorders>
+            <w:vAlign w:val="top"/>
+          </w:tcPr>
+          <w:p>
+            <w:pPr>
+              <w:jc w:val="right"/>
+            </w:pPr>
+            <w:r>
+              <w:drawing>
+                <wp:inline distT="0" distB="0" distL="0" distR="0">
+                  <wp:extent cx="609600" cy="609600"/>
+                  <wp:effectExtent t="0" r="0" b="0" l="0"/>
+                  <wp:docPr id="1" name="" descr="" title=""/>
+                  <wp:cNvGraphicFramePr>
+                    <a:graphicFrameLocks xmlns:a="http://schemas.openxmlformats.org/drawingml/2006/main" noChangeAspect="1"/>
+                  </wp:cNvGraphicFramePr>
+                  <a:graphic xmlns:a="http://schemas.openxmlformats.org/drawingml/2006/main">
+                    <a:graphicData uri="http://schemas.openxmlformats.org/drawingml/2006/picture">
+                      <pic:pic xmlns:pic="http://schemas.openxmlformats.org/drawingml/2006/picture">
+                        <pic:nvPicPr>
+                          <pic:cNvPr id="0" name="" descr=""/>
+                          <pic:cNvPicPr>
+                            <a:picLocks noChangeAspect="1" noChangeArrowheads="1"/>
+                          </pic:cNvPicPr>
+                        </pic:nvPicPr>
+                        <pic:blipFill>
+                          <a:blip r:embed="rId7" cstate="none"/>
+                          <a:srcRect/>
+                          <a:stretch>
+                            <a:fillRect/>
+                          </a:stretch>
+                        </pic:blipFill>
+                        <pic:spPr bwMode="auto">
+                          <a:xfrm>
+                            <a:off x="0" y="0"/>
+                            <a:ext cx="609600" cy="609600"/>
+                          </a:xfrm>
+                          <a:prstGeom prst="rect">
+                            <a:avLst/>
+                          </a:prstGeom>
+                        </pic:spPr>
+                      </pic:pic>
+                    </a:graphicData>
+                  </a:graphic>
+                </wp:inline>
+              </w:drawing>
+            </w:r>
+          </w:p>
+        </w:tc>
+      </w:tr>
+    </w:tbl>
     <w:p>
       <w:pPr>
         <w:spacing w:after="160"/>
       </w:pPr>
-      <w:r>
-        <w:rPr>
-          <w:i/>
-          <w:iCs/>
-          <w:color w:val="444444"/>
-          <w:sz w:val="22"/>
-          <w:szCs w:val="22"/>
-        </w:rPr>
-        <w:t xml:space="preserve">Your observations help us understand how the program is working.</w:t>
-      </w:r>
     </w:p>
     <w:tbl>
       <w:tblPr>

</xml_diff>

<commit_message>
Make pilot questionnaire logo larger and bolder for print
Header logo grows from ~0.67in to ~1.3in, and the mark itself uses
thicker strokes, higher-opacity echo rings, and deeper colors so it
holds up on a black-and-white office photocopier.

Co-Authored-By: Claude Sonnet 5 <noreply@anthropic.com>
Claude-Session: https://claude.ai/code/session_01GhHYXTvPcTQbmvy93Ygmjf
</commit_message>
<xml_diff>
--- a/docs/pilot/questionnaires/family-questionnaire.docx
+++ b/docs/pilot/questionnaires/family-questionnaire.docx
@@ -15,19 +15,20 @@
         </w:tblBorders>
       </w:tblPr>
       <w:tblGrid>
-        <w:gridCol w:w="8380"/>
-        <w:gridCol w:w="1700"/>
+        <w:gridCol w:w="7920"/>
+        <w:gridCol w:w="2160"/>
       </w:tblGrid>
       <w:tr>
         <w:tc>
           <w:tcPr>
-            <w:tcW w:type="dxa" w:w="8380"/>
+            <w:tcW w:type="dxa" w:w="7920"/>
             <w:tcBorders>
               <w:top w:val="none" w:color="FFFFFF" w:sz="0"/>
               <w:left w:val="none" w:color="FFFFFF" w:sz="0"/>
               <w:bottom w:val="none" w:color="FFFFFF" w:sz="0"/>
               <w:right w:val="none" w:color="FFFFFF" w:sz="0"/>
             </w:tcBorders>
+            <w:vAlign w:val="center"/>
           </w:tcPr>
           <w:p>
             <w:pPr>
@@ -78,7 +79,7 @@
         </w:tc>
         <w:tc>
           <w:tcPr>
-            <w:tcW w:type="dxa" w:w="1700"/>
+            <w:tcW w:type="dxa" w:w="2160"/>
             <w:tcBorders>
               <w:top w:val="none" w:color="FFFFFF" w:sz="0"/>
               <w:left w:val="none" w:color="FFFFFF" w:sz="0"/>
@@ -94,7 +95,7 @@
             <w:r>
               <w:drawing>
                 <wp:inline distT="0" distB="0" distL="0" distR="0">
-                  <wp:extent cx="609600" cy="609600"/>
+                  <wp:extent cx="1190625" cy="1190625"/>
                   <wp:effectExtent t="0" r="0" b="0" l="0"/>
                   <wp:docPr id="1" name="" descr="" title=""/>
                   <wp:cNvGraphicFramePr>
@@ -119,7 +120,7 @@
                         <pic:spPr bwMode="auto">
                           <a:xfrm>
                             <a:off x="0" y="0"/>
-                            <a:ext cx="609600" cy="609600"/>
+                            <a:ext cx="1190625" cy="1190625"/>
                           </a:xfrm>
                           <a:prstGeom prst="rect">
                             <a:avLst/>

</xml_diff>